<commit_message>
feat: auto-close SSO page with countdown and refresh IMP SSO docs to V2.0
Align implementation docs with dual-endpoint callback flow and add a 3-second closing countdown on the branded SSO success page.

Co-authored-by: Cursor <cursoragent@cursor.com>
</commit_message>
<xml_diff>
--- a/tools/imp-sso-doc/IMP_SSO_实现方案.docx
+++ b/tools/imp-sso-doc/IMP_SSO_实现方案.docx
@@ -19,11 +19,11 @@
         <w:rPr>
           <w:b/>
         </w:rPr>
-        <w:t>文档版本：V1.0    创建日期：2026-06-15</w:t>
+        <w:t>文档版本：V2.0    创建日期：2026-06-15</w:t>
         <w:br/>
       </w:r>
       <w:r>
-        <w:t>适用范围：Athlon Agent v2.0.5（feature/imp-sso）</w:t>
+        <w:t>适用范围：Athlon Agent（feature/imp-sso）</w:t>
       </w:r>
     </w:p>
     <w:p>
@@ -63,7 +63,7 @@
         <w:pStyle w:val="ListBullet"/>
       </w:pPr>
       <w:r>
-        <w:t>本地会话固定 24 小时有效，不做续期</w:t>
+        <w:t>本地会话固定 24 小时有效（SessionValidityHours），不做续期</w:t>
       </w:r>
     </w:p>
     <w:p>
@@ -72,6 +72,14 @@
       </w:pPr>
       <w:r>
         <w:t>标题栏显示 IMP 返回的 ename，支持登出</w:t>
+      </w:r>
+    </w:p>
+    <w:p>
+      <w:pPr>
+        <w:pStyle w:val="ListBullet"/>
+      </w:pPr>
+      <w:r>
+        <w:t>浏览器回调采用双端点设计：GET /sso/auth 返回认证页，POST /sso/complete 回传 token</w:t>
       </w:r>
     </w:p>
     <w:p>
@@ -171,7 +179,7 @@
           </w:tcPr>
           <w:p>
             <w:r>
-              <w:t>IMP timeoutRemaining 驱动过期</w:t>
+              <w:t>IMP timeoutRemaining 驱动本地过期</w:t>
             </w:r>
           </w:p>
         </w:tc>
@@ -181,7 +189,7 @@
           </w:tcPr>
           <w:p>
             <w:r>
-              <w:t>本地 LoggedInAt + 24h</w:t>
+              <w:t>本地 LoggedInAt + SessionValidityHours</w:t>
             </w:r>
           </w:p>
         </w:tc>
@@ -204,6 +212,28 @@
           <w:p>
             <w:r>
               <w:t>不实现续期</w:t>
+            </w:r>
+          </w:p>
+        </w:tc>
+      </w:tr>
+      <w:tr>
+        <w:tc>
+          <w:tcPr>
+            <w:tcW w:type="dxa" w:w="4320"/>
+          </w:tcPr>
+          <w:p>
+            <w:r>
+              <w:t>服务端直接读取 hash</w:t>
+            </w:r>
+          </w:p>
+        </w:tc>
+        <w:tc>
+          <w:tcPr>
+            <w:tcW w:type="dxa" w:w="4320"/>
+          </w:tcPr>
+          <w:p>
+            <w:r>
+              <w:t>浏览器 JS 解析 hash 后 POST JSON 到 /sso/complete</w:t>
             </w:r>
           </w:p>
         </w:tc>
@@ -236,9 +266,11 @@
         <w:br/>
         <w:t xml:space="preserve">    "Enabled": false,</w:t>
         <w:br/>
-        <w:t xml:space="preserve">    "ImpDomain": "www.icbcasia.com",</w:t>
+        <w:t xml:space="preserve">    "ImpDomain": "imp.icbcasiauat.com",</w:t>
         <w:br/>
         <w:t xml:space="preserve">    "AppId": "252",</w:t>
+        <w:br/>
+        <w:t xml:space="preserve">    "Msg": "123456789",</w:t>
         <w:br/>
         <w:t xml:space="preserve">    "Version": "20251127",</w:t>
         <w:br/>
@@ -255,6 +287,243 @@
         <w:t>}</w:t>
       </w:r>
     </w:p>
+    <w:tbl>
+      <w:tblPr>
+        <w:tblStyle w:val="TableGrid"/>
+        <w:tblW w:type="auto" w:w="0"/>
+        <w:tblLook w:firstColumn="1" w:firstRow="1" w:lastColumn="0" w:lastRow="0" w:noHBand="0" w:noVBand="1" w:val="04A0"/>
+      </w:tblPr>
+      <w:tblGrid>
+        <w:gridCol w:w="4320"/>
+        <w:gridCol w:w="4320"/>
+      </w:tblGrid>
+      <w:tr>
+        <w:tc>
+          <w:tcPr>
+            <w:tcW w:type="dxa" w:w="4320"/>
+          </w:tcPr>
+          <w:p>
+            <w:r>
+              <w:rPr>
+                <w:b/>
+              </w:rPr>
+              <w:t>配置项</w:t>
+            </w:r>
+          </w:p>
+        </w:tc>
+        <w:tc>
+          <w:tcPr>
+            <w:tcW w:type="dxa" w:w="4320"/>
+          </w:tcPr>
+          <w:p>
+            <w:r>
+              <w:rPr>
+                <w:b/>
+              </w:rPr>
+              <w:t>说明</w:t>
+            </w:r>
+          </w:p>
+        </w:tc>
+      </w:tr>
+      <w:tr>
+        <w:tc>
+          <w:tcPr>
+            <w:tcW w:type="dxa" w:w="4320"/>
+          </w:tcPr>
+          <w:p>
+            <w:r>
+              <w:t>Enabled</w:t>
+            </w:r>
+          </w:p>
+        </w:tc>
+        <w:tc>
+          <w:tcPr>
+            <w:tcW w:type="dxa" w:w="4320"/>
+          </w:tcPr>
+          <w:p>
+            <w:r>
+              <w:t>是否启用 IMP SSO，默认 false</w:t>
+            </w:r>
+          </w:p>
+        </w:tc>
+      </w:tr>
+      <w:tr>
+        <w:tc>
+          <w:tcPr>
+            <w:tcW w:type="dxa" w:w="4320"/>
+          </w:tcPr>
+          <w:p>
+            <w:r>
+              <w:t>ImpDomain</w:t>
+            </w:r>
+          </w:p>
+        </w:tc>
+        <w:tc>
+          <w:tcPr>
+            <w:tcW w:type="dxa" w:w="4320"/>
+          </w:tcPr>
+          <w:p>
+            <w:r>
+              <w:t>IMP 域名，UAT 默认 imp.icbcasiauat.com，生产切换为正式域名</w:t>
+            </w:r>
+          </w:p>
+        </w:tc>
+      </w:tr>
+      <w:tr>
+        <w:tc>
+          <w:tcPr>
+            <w:tcW w:type="dxa" w:w="4320"/>
+          </w:tcPr>
+          <w:p>
+            <w:r>
+              <w:t>AppId</w:t>
+            </w:r>
+          </w:p>
+        </w:tc>
+        <w:tc>
+          <w:tcPr>
+            <w:tcW w:type="dxa" w:w="4320"/>
+          </w:tcPr>
+          <w:p>
+            <w:r>
+              <w:t>IMP 子应用 ID（impappid）</w:t>
+            </w:r>
+          </w:p>
+        </w:tc>
+      </w:tr>
+      <w:tr>
+        <w:tc>
+          <w:tcPr>
+            <w:tcW w:type="dxa" w:w="4320"/>
+          </w:tcPr>
+          <w:p>
+            <w:r>
+              <w:t>Msg</w:t>
+            </w:r>
+          </w:p>
+        </w:tc>
+        <w:tc>
+          <w:tcPr>
+            <w:tcW w:type="dxa" w:w="4320"/>
+          </w:tcPr>
+          <w:p>
+            <w:r>
+              <w:t>IMP 子应用标识，用于 index.html 的 msg 参数</w:t>
+            </w:r>
+          </w:p>
+        </w:tc>
+      </w:tr>
+      <w:tr>
+        <w:tc>
+          <w:tcPr>
+            <w:tcW w:type="dxa" w:w="4320"/>
+          </w:tcPr>
+          <w:p>
+            <w:r>
+              <w:t>Version</w:t>
+            </w:r>
+          </w:p>
+        </w:tc>
+        <w:tc>
+          <w:tcPr>
+            <w:tcW w:type="dxa" w:w="4320"/>
+          </w:tcPr>
+          <w:p>
+            <w:r>
+              <w:t>check_ssotoken 接口版本号</w:t>
+            </w:r>
+          </w:p>
+        </w:tc>
+      </w:tr>
+      <w:tr>
+        <w:tc>
+          <w:tcPr>
+            <w:tcW w:type="dxa" w:w="4320"/>
+          </w:tcPr>
+          <w:p>
+            <w:r>
+              <w:t>SessionValidityHours</w:t>
+            </w:r>
+          </w:p>
+        </w:tc>
+        <w:tc>
+          <w:tcPr>
+            <w:tcW w:type="dxa" w:w="4320"/>
+          </w:tcPr>
+          <w:p>
+            <w:r>
+              <w:t>本地会话有效期（小时），默认 24</w:t>
+            </w:r>
+          </w:p>
+        </w:tc>
+      </w:tr>
+      <w:tr>
+        <w:tc>
+          <w:tcPr>
+            <w:tcW w:type="dxa" w:w="4320"/>
+          </w:tcPr>
+          <w:p>
+            <w:r>
+              <w:t>CallbackPort</w:t>
+            </w:r>
+          </w:p>
+        </w:tc>
+        <w:tc>
+          <w:tcPr>
+            <w:tcW w:type="dxa" w:w="4320"/>
+          </w:tcPr>
+          <w:p>
+            <w:r>
+              <w:t>本地回调监听端口，默认 5657</w:t>
+            </w:r>
+          </w:p>
+        </w:tc>
+      </w:tr>
+      <w:tr>
+        <w:tc>
+          <w:tcPr>
+            <w:tcW w:type="dxa" w:w="4320"/>
+          </w:tcPr>
+          <w:p>
+            <w:r>
+              <w:t>CallbackPath</w:t>
+            </w:r>
+          </w:p>
+        </w:tc>
+        <w:tc>
+          <w:tcPr>
+            <w:tcW w:type="dxa" w:w="4320"/>
+          </w:tcPr>
+          <w:p>
+            <w:r>
+              <w:t>认证页路径，默认 /sso/auth</w:t>
+            </w:r>
+          </w:p>
+        </w:tc>
+      </w:tr>
+      <w:tr>
+        <w:tc>
+          <w:tcPr>
+            <w:tcW w:type="dxa" w:w="4320"/>
+          </w:tcPr>
+          <w:p>
+            <w:r>
+              <w:t>CompletePath</w:t>
+            </w:r>
+          </w:p>
+        </w:tc>
+        <w:tc>
+          <w:tcPr>
+            <w:tcW w:type="dxa" w:w="4320"/>
+          </w:tcPr>
+          <w:p>
+            <w:r>
+              <w:t>token 回传路径，默认 /sso/complete</w:t>
+            </w:r>
+          </w:p>
+        </w:tc>
+      </w:tr>
+    </w:tbl>
     <w:tbl>
       <w:tblPr>
         <w:tblStyle w:val="TableGrid"/>
@@ -351,7 +620,7 @@
         <w:pStyle w:val="ListBullet"/>
       </w:pPr>
       <w:r>
-        <w:t>IMP 登录成功 → POST check_ssotoken（仅此一次）→ 存 ssotoken + ename</w:t>
+        <w:t>IMP 登录成功 → 浏览器 POST /sso/complete → Agent POST check_ssotoken（仅此一次）→ 存 ssotoken + ename</w:t>
       </w:r>
     </w:p>
     <w:p>
@@ -367,7 +636,15 @@
         <w:pStyle w:val="ListBullet"/>
       </w:pPr>
       <w:r>
-        <w:t>24h 内再次启动：读 DPAPI 缓存，不调 IMP</w:t>
+        <w:t>会话持久化至 ~/.athlon-agent/credentials/sso-session.secret（DPAPI 加密）</w:t>
+      </w:r>
+    </w:p>
+    <w:p>
+      <w:pPr>
+        <w:pStyle w:val="ListBullet"/>
+      </w:pPr>
+      <w:r>
+        <w:t>24h 内再次启动：读 DPAPI 缓存，不调 IMP、不打开浏览器</w:t>
       </w:r>
     </w:p>
     <w:p>
@@ -398,7 +675,7 @@
       <w:r>
         <w:drawing>
           <wp:inline xmlns:a="http://schemas.openxmlformats.org/drawingml/2006/main" xmlns:pic="http://schemas.openxmlformats.org/drawingml/2006/picture">
-            <wp:extent cx="5943600" cy="4651513"/>
+            <wp:extent cx="5943600" cy="5039139"/>
             <wp:docPr id="1" name="Picture 1"/>
             <wp:cNvGraphicFramePr>
               <a:graphicFrameLocks noChangeAspect="1"/>
@@ -419,7 +696,7 @@
                   <pic:spPr>
                     <a:xfrm>
                       <a:off x="0" y="0"/>
-                      <a:ext cx="5943600" cy="4651513"/>
+                      <a:ext cx="5943600" cy="5039139"/>
                     </a:xfrm>
                     <a:prstGeom prst="rect"/>
                   </pic:spPr>
@@ -462,7 +739,7 @@
       <w:r>
         <w:drawing>
           <wp:inline xmlns:a="http://schemas.openxmlformats.org/drawingml/2006/main" xmlns:pic="http://schemas.openxmlformats.org/drawingml/2006/picture">
-            <wp:extent cx="5943600" cy="3760237"/>
+            <wp:extent cx="5943600" cy="4002832"/>
             <wp:docPr id="2" name="Picture 2"/>
             <wp:cNvGraphicFramePr>
               <a:graphicFrameLocks noChangeAspect="1"/>
@@ -483,7 +760,7 @@
                   <pic:spPr>
                     <a:xfrm>
                       <a:off x="0" y="0"/>
-                      <a:ext cx="5943600" cy="3760237"/>
+                      <a:ext cx="5943600" cy="4002832"/>
                     </a:xfrm>
                     <a:prstGeom prst="rect"/>
                   </pic:spPr>
@@ -503,7 +780,7 @@
           <w:i/>
           <w:color w:val="666666"/>
         </w:rPr>
-        <w:t>图 2  IMP 浏览器登录与 hash 回调时序</w:t>
+        <w:t>图 2  IMP 浏览器登录与双端点回调时序</w:t>
       </w:r>
     </w:p>
     <w:p>
@@ -575,7 +852,7 @@
           </w:tcPr>
           <w:p>
             <w:r>
-              <w:t>/icbcasia/imp/index.html</w:t>
+              <w:t>/icbcasia/imp/index.html?toLogin=true&amp;appId={AppId}&amp;msg={Msg}#/login</w:t>
             </w:r>
           </w:p>
         </w:tc>
@@ -607,7 +884,7 @@
           </w:tcPr>
           <w:p>
             <w:r>
-              <w:t>hash 回调拿到 ssotoken 后调用一次</w:t>
+              <w:t>收到 /sso/complete 回调后调用一次</w:t>
             </w:r>
           </w:p>
         </w:tc>
@@ -619,7 +896,7 @@
           </w:tcPr>
           <w:p>
             <w:r>
-              <w:t>/icbcasia/imp/getsaubapp</w:t>
+              <w:t>GET localhost:{CallbackPort}/sso/auth</w:t>
             </w:r>
           </w:p>
         </w:tc>
@@ -629,7 +906,29 @@
           </w:tcPr>
           <w:p>
             <w:r>
-              <w:t>可选；回调 URL 已固定时可跳过</w:t>
+              <w:t>IMP 重定向后浏览器请求认证页</w:t>
+            </w:r>
+          </w:p>
+        </w:tc>
+      </w:tr>
+      <w:tr>
+        <w:tc>
+          <w:tcPr>
+            <w:tcW w:type="dxa" w:w="4320"/>
+          </w:tcPr>
+          <w:p>
+            <w:r>
+              <w:t>POST localhost:{CallbackPort}/sso/complete</w:t>
+            </w:r>
+          </w:p>
+        </w:tc>
+        <w:tc>
+          <w:tcPr>
+            <w:tcW w:type="dxa" w:w="4320"/>
+          </w:tcPr>
+          <w:p>
+            <w:r>
+              <w:t>认证页 JS 解析 hash 后回传 JSON</w:t>
             </w:r>
           </w:p>
         </w:tc>
@@ -648,12 +947,12 @@
         <w:pStyle w:val="IntenseQuote"/>
       </w:pPr>
       <w:r>
-        <w:t>POST https://{ImpDomain}/icbcasia/imp/check_ssotoken?version=20251127</w:t>
+        <w:t>POST https://{ImpDomain}/icbcasia/imp/check_ssotoken?version={Version}</w:t>
         <w:br/>
         <w:t>Content-Type: application/x-www-form-urlencoded</w:t>
         <w:br/>
         <w:br/>
-        <w:t>ssotoken={token}&amp;impappid=252&amp;dse_sessionId={token}&amp;requestip={localIp}</w:t>
+        <w:t>ssotoken={token}&amp;impappid={AppId}&amp;dse_sessionId={token}&amp;requestip={localIp}</w:t>
       </w:r>
     </w:p>
     <w:p>
@@ -661,7 +960,236 @@
         <w:pStyle w:val="Heading2"/>
       </w:pPr>
       <w:r>
-        <w:t>5.3 回调 URL 格式</w:t>
+        <w:t>5.3 check_ssotoken 响应解析</w:t>
+      </w:r>
+    </w:p>
+    <w:tbl>
+      <w:tblPr>
+        <w:tblStyle w:val="TableGrid"/>
+        <w:tblW w:type="auto" w:w="0"/>
+        <w:tblLook w:firstColumn="1" w:firstRow="1" w:lastColumn="0" w:lastRow="0" w:noHBand="0" w:noVBand="1" w:val="04A0"/>
+      </w:tblPr>
+      <w:tblGrid>
+        <w:gridCol w:w="2880"/>
+        <w:gridCol w:w="2880"/>
+        <w:gridCol w:w="2880"/>
+      </w:tblGrid>
+      <w:tr>
+        <w:tc>
+          <w:tcPr>
+            <w:tcW w:type="dxa" w:w="2880"/>
+          </w:tcPr>
+          <w:p>
+            <w:r>
+              <w:rPr>
+                <w:b/>
+              </w:rPr>
+              <w:t>条件</w:t>
+            </w:r>
+          </w:p>
+        </w:tc>
+        <w:tc>
+          <w:tcPr>
+            <w:tcW w:type="dxa" w:w="2880"/>
+          </w:tcPr>
+          <w:p>
+            <w:r>
+              <w:rPr>
+                <w:b/>
+              </w:rPr>
+              <w:t>状态</w:t>
+            </w:r>
+          </w:p>
+        </w:tc>
+        <w:tc>
+          <w:tcPr>
+            <w:tcW w:type="dxa" w:w="2880"/>
+          </w:tcPr>
+          <w:p>
+            <w:r>
+              <w:rPr>
+                <w:b/>
+              </w:rPr>
+              <w:t>处理</w:t>
+            </w:r>
+          </w:p>
+        </w:tc>
+      </w:tr>
+      <w:tr>
+        <w:tc>
+          <w:tcPr>
+            <w:tcW w:type="dxa" w:w="2880"/>
+          </w:tcPr>
+          <w:p>
+            <w:r>
+              <w:t>retcode = 1</w:t>
+            </w:r>
+          </w:p>
+        </w:tc>
+        <w:tc>
+          <w:tcPr>
+            <w:tcW w:type="dxa" w:w="2880"/>
+          </w:tcPr>
+          <w:p>
+            <w:r>
+              <w:t>ReLoginRequired</w:t>
+            </w:r>
+          </w:p>
+        </w:tc>
+        <w:tc>
+          <w:tcPr>
+            <w:tcW w:type="dxa" w:w="2880"/>
+          </w:tcPr>
+          <w:p>
+            <w:r>
+              <w:t>提示重新登录</w:t>
+            </w:r>
+          </w:p>
+        </w:tc>
+      </w:tr>
+      <w:tr>
+        <w:tc>
+          <w:tcPr>
+            <w:tcW w:type="dxa" w:w="2880"/>
+          </w:tcPr>
+          <w:p>
+            <w:r>
+              <w:t>roleUserRelNum &lt;= 0</w:t>
+            </w:r>
+          </w:p>
+        </w:tc>
+        <w:tc>
+          <w:tcPr>
+            <w:tcW w:type="dxa" w:w="2880"/>
+          </w:tcPr>
+          <w:p>
+            <w:r>
+              <w:t>NoRole</w:t>
+            </w:r>
+          </w:p>
+        </w:tc>
+        <w:tc>
+          <w:tcPr>
+            <w:tcW w:type="dxa" w:w="2880"/>
+          </w:tcPr>
+          <w:p>
+            <w:r>
+              <w:t>提示无角色，打开 noRoleForSubApp 页面</w:t>
+            </w:r>
+          </w:p>
+        </w:tc>
+      </w:tr>
+      <w:tr>
+        <w:tc>
+          <w:tcPr>
+            <w:tcW w:type="dxa" w:w="2880"/>
+          </w:tcPr>
+          <w:p>
+            <w:r>
+              <w:t>返回 HTML 登录页</w:t>
+            </w:r>
+          </w:p>
+        </w:tc>
+        <w:tc>
+          <w:tcPr>
+            <w:tcW w:type="dxa" w:w="2880"/>
+          </w:tcPr>
+          <w:p>
+            <w:r>
+              <w:t>LoginRequired</w:t>
+            </w:r>
+          </w:p>
+        </w:tc>
+        <w:tc>
+          <w:tcPr>
+            <w:tcW w:type="dxa" w:w="2880"/>
+          </w:tcPr>
+          <w:p>
+            <w:r>
+              <w:t>需要 IMP 登录</w:t>
+            </w:r>
+          </w:p>
+        </w:tc>
+      </w:tr>
+      <w:tr>
+        <w:tc>
+          <w:tcPr>
+            <w:tcW w:type="dxa" w:w="2880"/>
+          </w:tcPr>
+          <w:p>
+            <w:r>
+              <w:t>userid + timeoutRemaining &gt; 0</w:t>
+            </w:r>
+          </w:p>
+        </w:tc>
+        <w:tc>
+          <w:tcPr>
+            <w:tcW w:type="dxa" w:w="2880"/>
+          </w:tcPr>
+          <w:p>
+            <w:r>
+              <w:t>Valid</w:t>
+            </w:r>
+          </w:p>
+        </w:tc>
+        <w:tc>
+          <w:tcPr>
+            <w:tcW w:type="dxa" w:w="2880"/>
+          </w:tcPr>
+          <w:p>
+            <w:r>
+              <w:t>提取 ename 作为 DisplayName，创建会话</w:t>
+            </w:r>
+          </w:p>
+        </w:tc>
+      </w:tr>
+      <w:tr>
+        <w:tc>
+          <w:tcPr>
+            <w:tcW w:type="dxa" w:w="2880"/>
+          </w:tcPr>
+          <w:p>
+            <w:r>
+              <w:t>HTTP 非 200 或解析失败</w:t>
+            </w:r>
+          </w:p>
+        </w:tc>
+        <w:tc>
+          <w:tcPr>
+            <w:tcW w:type="dxa" w:w="2880"/>
+          </w:tcPr>
+          <w:p>
+            <w:r>
+              <w:t>Invalid</w:t>
+            </w:r>
+          </w:p>
+        </w:tc>
+        <w:tc>
+          <w:tcPr>
+            <w:tcW w:type="dxa" w:w="2880"/>
+          </w:tcPr>
+          <w:p>
+            <w:r>
+              <w:t>显示错误信息，退出应用</w:t>
+            </w:r>
+          </w:p>
+        </w:tc>
+      </w:tr>
+    </w:tbl>
+    <w:p>
+      <w:pPr>
+        <w:pStyle w:val="Heading2"/>
+      </w:pPr>
+      <w:r>
+        <w:t>5.4 回调 URL 与双端点流程</w:t>
+      </w:r>
+    </w:p>
+    <w:p>
+      <w:r>
+        <w:rPr>
+          <w:b w:val="0"/>
+        </w:rPr>
+        <w:t>IMP 登录成功后重定向至：</w:t>
       </w:r>
     </w:p>
     <w:p>
@@ -673,11 +1201,77 @@
       </w:r>
     </w:p>
     <w:p>
+      <w:pPr>
+        <w:pStyle w:val="ListBullet"/>
+      </w:pPr>
       <w:r>
-        <w:rPr>
-          <w:b w:val="0"/>
-        </w:rPr>
-        <w:t>注意：token 在 URL hash 中，HttpListener 无法直接读取，需 /sso/auth 返回 JS 解析页。</w:t>
+        <w:t>token 在 URL hash 中，HttpListener 无法直接读取</w:t>
+      </w:r>
+    </w:p>
+    <w:p>
+      <w:pPr>
+        <w:pStyle w:val="ListBullet"/>
+      </w:pPr>
+      <w:r>
+        <w:t>GET /sso/auth → 返回 ImpSsoAuthPageHtml 认证页（含加载/成功/失败状态）</w:t>
+      </w:r>
+    </w:p>
+    <w:p>
+      <w:pPr>
+        <w:pStyle w:val="ListBullet"/>
+      </w:pPr>
+      <w:r>
+        <w:t>浏览器 JS 解析 hash → POST /sso/complete（JSON body）</w:t>
+      </w:r>
+    </w:p>
+    <w:p>
+      <w:pPr>
+        <w:pStyle w:val="ListBullet"/>
+      </w:pPr>
+      <w:r>
+        <w:t>服务端校验 token 非空后返回 {ok: true}，同时唤醒 Agent 等待线程</w:t>
+      </w:r>
+    </w:p>
+    <w:p>
+      <w:pPr>
+        <w:pStyle w:val="ListBullet"/>
+      </w:pPr>
+      <w:r>
+        <w:t>Agent 收到 payload 后校验 appId，再调用 check_ssotoken 二次校验</w:t>
+      </w:r>
+    </w:p>
+    <w:p>
+      <w:pPr>
+        <w:pStyle w:val="Heading2"/>
+      </w:pPr>
+      <w:r>
+        <w:t>5.5 /sso/complete 请求体</w:t>
+      </w:r>
+    </w:p>
+    <w:p>
+      <w:pPr>
+        <w:pStyle w:val="IntenseQuote"/>
+      </w:pPr>
+      <w:r>
+        <w:t>{</w:t>
+        <w:br/>
+        <w:t xml:space="preserve">  "appId": "252",</w:t>
+        <w:br/>
+        <w:t xml:space="preserve">  "userId": "000974115",</w:t>
+        <w:br/>
+        <w:t xml:space="preserve">  "locale": "zh_HK",</w:t>
+        <w:br/>
+        <w:t xml:space="preserve">  "token": "{ssotoken}",</w:t>
+        <w:br/>
+        <w:t xml:space="preserve">  "role": "User",</w:t>
+        <w:br/>
+        <w:t xml:space="preserve">  "depname": "FTD",</w:t>
+        <w:br/>
+        <w:t xml:space="preserve">  "channel_type": null,</w:t>
+        <w:br/>
+        <w:t xml:space="preserve">  "msg": null</w:t>
+        <w:br/>
+        <w:t>}</w:t>
       </w:r>
     </w:p>
     <w:p>
@@ -767,7 +1361,7 @@
           </w:tcPr>
           <w:p>
             <w:r>
-              <w:t>配置项，Enabled 默认 false</w:t>
+              <w:t>配置项，含 Msg、Enabled 默认 false</w:t>
             </w:r>
           </w:p>
         </w:tc>
@@ -799,7 +1393,39 @@
           </w:tcPr>
           <w:p>
             <w:r>
-              <w:t>SsoToken、DisplayName、ExpiresAt</w:t>
+              <w:t>SsoToken、UserId、DisplayName、LoggedInAt、ExpiresAt</w:t>
+            </w:r>
+          </w:p>
+        </w:tc>
+      </w:tr>
+      <w:tr>
+        <w:tc>
+          <w:tcPr>
+            <w:tcW w:type="dxa" w:w="2880"/>
+          </w:tcPr>
+          <w:p>
+            <w:r>
+              <w:t>ImpSsoCallbackPayload</w:t>
+            </w:r>
+          </w:p>
+        </w:tc>
+        <w:tc>
+          <w:tcPr>
+            <w:tcW w:type="dxa" w:w="2880"/>
+          </w:tcPr>
+          <w:p>
+            <w:r>
+              <w:t>Athlon.Agent.Core/Sso/</w:t>
+            </w:r>
+          </w:p>
+        </w:tc>
+        <w:tc>
+          <w:tcPr>
+            <w:tcW w:type="dxa" w:w="2880"/>
+          </w:tcPr>
+          <w:p>
+            <w:r>
+              <w:t>浏览器回传的 hash 参数字段</w:t>
             </w:r>
           </w:p>
         </w:tc>
@@ -831,7 +1457,7 @@
           </w:tcPr>
           <w:p>
             <w:r>
-              <w:t>DPAPI 加密持久化</w:t>
+              <w:t>DPAPI 加密持久化至 credentials/sso-session.secret</w:t>
             </w:r>
           </w:p>
         </w:tc>
@@ -863,7 +1489,39 @@
           </w:tcPr>
           <w:p>
             <w:r>
-              <w:t>POST check_ssotoken</w:t>
+              <w:t>构建登录 URL、POST check_ssotoken、CompleteLoginAsync</w:t>
+            </w:r>
+          </w:p>
+        </w:tc>
+      </w:tr>
+      <w:tr>
+        <w:tc>
+          <w:tcPr>
+            <w:tcW w:type="dxa" w:w="2880"/>
+          </w:tcPr>
+          <w:p>
+            <w:r>
+              <w:t>ImpSsoResponseParser</w:t>
+            </w:r>
+          </w:p>
+        </w:tc>
+        <w:tc>
+          <w:tcPr>
+            <w:tcW w:type="dxa" w:w="2880"/>
+          </w:tcPr>
+          <w:p>
+            <w:r>
+              <w:t>Infrastructure/Sso/</w:t>
+            </w:r>
+          </w:p>
+        </w:tc>
+        <w:tc>
+          <w:tcPr>
+            <w:tcW w:type="dxa" w:w="2880"/>
+          </w:tcPr>
+          <w:p>
+            <w:r>
+              <w:t>解析 check_ssotoken JSON 响应</w:t>
             </w:r>
           </w:p>
         </w:tc>
@@ -895,7 +1553,39 @@
           </w:tcPr>
           <w:p>
             <w:r>
-              <w:t>5657 端口 hash 回调</w:t>
+              <w:t>5657 端口双端点回调服务</w:t>
+            </w:r>
+          </w:p>
+        </w:tc>
+      </w:tr>
+      <w:tr>
+        <w:tc>
+          <w:tcPr>
+            <w:tcW w:type="dxa" w:w="2880"/>
+          </w:tcPr>
+          <w:p>
+            <w:r>
+              <w:t>ImpSsoAuthPageHtml</w:t>
+            </w:r>
+          </w:p>
+        </w:tc>
+        <w:tc>
+          <w:tcPr>
+            <w:tcW w:type="dxa" w:w="2880"/>
+          </w:tcPr>
+          <w:p>
+            <w:r>
+              <w:t>Infrastructure/Sso/</w:t>
+            </w:r>
+          </w:p>
+        </w:tc>
+        <w:tc>
+          <w:tcPr>
+            <w:tcW w:type="dxa" w:w="2880"/>
+          </w:tcPr>
+          <w:p>
+            <w:r>
+              <w:t>认证页 HTML（hash 解析 + fetch POST）</w:t>
             </w:r>
           </w:p>
         </w:tc>
@@ -927,7 +1617,39 @@
           </w:tcPr>
           <w:p>
             <w:r>
-              <w:t>启动门控编排</w:t>
+              <w:t>启动门控编排、等待窗口、浏览器登录</w:t>
+            </w:r>
+          </w:p>
+        </w:tc>
+      </w:tr>
+      <w:tr>
+        <w:tc>
+          <w:tcPr>
+            <w:tcW w:type="dxa" w:w="2880"/>
+          </w:tcPr>
+          <w:p>
+            <w:r>
+              <w:t>ImpSsoLoginWaitingWindow</w:t>
+            </w:r>
+          </w:p>
+        </w:tc>
+        <w:tc>
+          <w:tcPr>
+            <w:tcW w:type="dxa" w:w="2880"/>
+          </w:tcPr>
+          <w:p>
+            <w:r>
+              <w:t>App/Licensing/</w:t>
+            </w:r>
+          </w:p>
+        </w:tc>
+        <w:tc>
+          <w:tcPr>
+            <w:tcW w:type="dxa" w:w="2880"/>
+          </w:tcPr>
+          <w:p>
+            <w:r>
+              <w:t>登录等待提示窗口</w:t>
             </w:r>
           </w:p>
         </w:tc>
@@ -959,7 +1681,7 @@
           </w:tcPr>
           <w:p>
             <w:r>
-              <w:t>标题栏 ename + 登出</w:t>
+              <w:t>标题栏 ename 显示 + 登出</w:t>
             </w:r>
           </w:p>
         </w:tc>
@@ -978,11 +1700,19 @@
         <w:pStyle w:val="ListNumber"/>
       </w:pPr>
       <w:r>
-        <w:t>1. 若 Sso.Enabled → ImpSsoStartupGate.EnsureAuthenticated</w:t>
+        <w:t>1. StartupUpdateGate.CheckBeforeStartupGates</w:t>
         <w:br/>
-        <w:t>2. LicenseStartupGate.EnsureLicensed</w:t>
+        <w:t>2. 若 Sso.Enabled → ImpSsoStartupGate.EnsureAuthenticated</w:t>
         <w:br/>
-        <w:t>3. DI 注册 + MainWindow</w:t>
+        <w:t xml:space="preserve">   a. 读 DPAPI 缓存，未过期则直接通过</w:t>
+        <w:br/>
+        <w:t xml:space="preserve">   b. 过期则显示 ImpSsoLoginWaitingWindow，后台线程执行浏览器登录</w:t>
+        <w:br/>
+        <w:t xml:space="preserve">   c. 登录超时 5 分钟</w:t>
+        <w:br/>
+        <w:t>3. LicenseStartupGate.EnsureLicensed</w:t>
+        <w:br/>
+        <w:t>4. DI 注册 + MainWindow</w:t>
       </w:r>
     </w:p>
     <w:p>
@@ -998,7 +1728,7 @@
         <w:pStyle w:val="ListBullet"/>
       </w:pPr>
       <w:r>
-        <w:t>Sso.Enabled=true：标题栏右侧显示 ename（IMP 返回）</w:t>
+        <w:t>Sso.Enabled=true：标题栏右侧显示 ename（IMP 返回，无 ename 时回退 userid）</w:t>
       </w:r>
     </w:p>
     <w:p>
@@ -1019,6 +1749,22 @@
     </w:p>
     <w:p>
       <w:pPr>
+        <w:pStyle w:val="ListBullet"/>
+      </w:pPr>
+      <w:r>
+        <w:t>浏览器认证页：加载中 → 成功（可关闭）/ 失败（显示 IMP msg 或通用错误）</w:t>
+      </w:r>
+    </w:p>
+    <w:p>
+      <w:pPr>
+        <w:pStyle w:val="ListBullet"/>
+      </w:pPr>
+      <w:r>
+        <w:t>登录等待窗口：提示用户已在浏览器中打开登录页，登录成功后自动关闭</w:t>
+      </w:r>
+    </w:p>
+    <w:p>
+      <w:pPr>
         <w:pStyle w:val="Heading1"/>
       </w:pPr>
       <w:r>
@@ -1030,7 +1776,7 @@
         <w:pStyle w:val="ListBullet"/>
       </w:pPr>
       <w:r>
-        <w:t>ssotoken 使用 Windows DPAPI 加密存储（CurrentUser）</w:t>
+        <w:t>ssotoken 使用 Windows DPAPI 加密存储（CurrentUser），文件路径 credentials/sso-session.secret</w:t>
       </w:r>
     </w:p>
     <w:p>
@@ -1039,6 +1785,14 @@
       </w:pPr>
       <w:r>
         <w:t>回调 token 不可信，必须 check_ssotoken 二次校验</w:t>
+      </w:r>
+    </w:p>
+    <w:p>
+      <w:pPr>
+        <w:pStyle w:val="ListBullet"/>
+      </w:pPr>
+      <w:r>
+        <w:t>回调 appId 与配置 AppId 不一致时拒绝登录</w:t>
       </w:r>
     </w:p>
     <w:p>
@@ -1059,10 +1813,239 @@
     </w:p>
     <w:p>
       <w:pPr>
+        <w:pStyle w:val="ListBullet"/>
+      </w:pPr>
+      <w:r>
+        <w:t>CallbackServer 在收到回调后优雅关闭，等待进行中的请求排空（最多 5 秒）</w:t>
+      </w:r>
+    </w:p>
+    <w:p>
+      <w:pPr>
         <w:pStyle w:val="Heading1"/>
       </w:pPr>
       <w:r>
-        <w:t>10. 验收标准</w:t>
+        <w:t>10. 错误处理</w:t>
+      </w:r>
+    </w:p>
+    <w:tbl>
+      <w:tblPr>
+        <w:tblStyle w:val="TableGrid"/>
+        <w:tblW w:type="auto" w:w="0"/>
+        <w:tblLook w:firstColumn="1" w:firstRow="1" w:lastColumn="0" w:lastRow="0" w:noHBand="0" w:noVBand="1" w:val="04A0"/>
+      </w:tblPr>
+      <w:tblGrid>
+        <w:gridCol w:w="2880"/>
+        <w:gridCol w:w="2880"/>
+        <w:gridCol w:w="2880"/>
+      </w:tblGrid>
+      <w:tr>
+        <w:tc>
+          <w:tcPr>
+            <w:tcW w:type="dxa" w:w="2880"/>
+          </w:tcPr>
+          <w:p>
+            <w:r>
+              <w:rPr>
+                <w:b/>
+              </w:rPr>
+              <w:t>场景</w:t>
+            </w:r>
+          </w:p>
+        </w:tc>
+        <w:tc>
+          <w:tcPr>
+            <w:tcW w:type="dxa" w:w="2880"/>
+          </w:tcPr>
+          <w:p>
+            <w:r>
+              <w:rPr>
+                <w:b/>
+              </w:rPr>
+              <w:t>用户提示</w:t>
+            </w:r>
+          </w:p>
+        </w:tc>
+        <w:tc>
+          <w:tcPr>
+            <w:tcW w:type="dxa" w:w="2880"/>
+          </w:tcPr>
+          <w:p>
+            <w:r>
+              <w:rPr>
+                <w:b/>
+              </w:rPr>
+              <w:t>应用行为</w:t>
+            </w:r>
+          </w:p>
+        </w:tc>
+      </w:tr>
+      <w:tr>
+        <w:tc>
+          <w:tcPr>
+            <w:tcW w:type="dxa" w:w="2880"/>
+          </w:tcPr>
+          <w:p>
+            <w:r>
+              <w:t>登录超时（5 分钟）</w:t>
+            </w:r>
+          </w:p>
+        </w:tc>
+        <w:tc>
+          <w:tcPr>
+            <w:tcW w:type="dxa" w:w="2880"/>
+          </w:tcPr>
+          <w:p>
+            <w:r>
+              <w:t>IMP 登录超时，请重试</w:t>
+            </w:r>
+          </w:p>
+        </w:tc>
+        <w:tc>
+          <w:tcPr>
+            <w:tcW w:type="dxa" w:w="2880"/>
+          </w:tcPr>
+          <w:p>
+            <w:r>
+              <w:t>退出应用</w:t>
+            </w:r>
+          </w:p>
+        </w:tc>
+      </w:tr>
+      <w:tr>
+        <w:tc>
+          <w:tcPr>
+            <w:tcW w:type="dxa" w:w="2880"/>
+          </w:tcPr>
+          <w:p>
+            <w:r>
+              <w:t>NoRole（无可用角色）</w:t>
+            </w:r>
+          </w:p>
+        </w:tc>
+        <w:tc>
+          <w:tcPr>
+            <w:tcW w:type="dxa" w:w="2880"/>
+          </w:tcPr>
+          <w:p>
+            <w:r>
+              <w:t>当前登录用户无可用角色</w:t>
+            </w:r>
+          </w:p>
+        </w:tc>
+        <w:tc>
+          <w:tcPr>
+            <w:tcW w:type="dxa" w:w="2880"/>
+          </w:tcPr>
+          <w:p>
+            <w:r>
+              <w:t>打开 noRoleForSubApp 页面，退出应用</w:t>
+            </w:r>
+          </w:p>
+        </w:tc>
+      </w:tr>
+      <w:tr>
+        <w:tc>
+          <w:tcPr>
+            <w:tcW w:type="dxa" w:w="2880"/>
+          </w:tcPr>
+          <w:p>
+            <w:r>
+              <w:t>ReLoginRequired</w:t>
+            </w:r>
+          </w:p>
+        </w:tc>
+        <w:tc>
+          <w:tcPr>
+            <w:tcW w:type="dxa" w:w="2880"/>
+          </w:tcPr>
+          <w:p>
+            <w:r>
+              <w:t>IMP 返回的 retmsg</w:t>
+            </w:r>
+          </w:p>
+        </w:tc>
+        <w:tc>
+          <w:tcPr>
+            <w:tcW w:type="dxa" w:w="2880"/>
+          </w:tcPr>
+          <w:p>
+            <w:r>
+              <w:t>退出应用</w:t>
+            </w:r>
+          </w:p>
+        </w:tc>
+      </w:tr>
+      <w:tr>
+        <w:tc>
+          <w:tcPr>
+            <w:tcW w:type="dxa" w:w="2880"/>
+          </w:tcPr>
+          <w:p>
+            <w:r>
+              <w:t>hash 无 token</w:t>
+            </w:r>
+          </w:p>
+        </w:tc>
+        <w:tc>
+          <w:tcPr>
+            <w:tcW w:type="dxa" w:w="2880"/>
+          </w:tcPr>
+          <w:p>
+            <w:r>
+              <w:t>浏览器页显示 IMP msg 或通用错误</w:t>
+            </w:r>
+          </w:p>
+        </w:tc>
+        <w:tc>
+          <w:tcPr>
+            <w:tcW w:type="dxa" w:w="2880"/>
+          </w:tcPr>
+          <w:p>
+            <w:r>
+              <w:t>等待超时后退出</w:t>
+            </w:r>
+          </w:p>
+        </w:tc>
+      </w:tr>
+      <w:tr>
+        <w:tc>
+          <w:tcPr>
+            <w:tcW w:type="dxa" w:w="2880"/>
+          </w:tcPr>
+          <w:p>
+            <w:r>
+              <w:t>check_ssotoken 失败</w:t>
+            </w:r>
+          </w:p>
+        </w:tc>
+        <w:tc>
+          <w:tcPr>
+            <w:tcW w:type="dxa" w:w="2880"/>
+          </w:tcPr>
+          <w:p>
+            <w:r>
+              <w:t>IMP SSO 登录失败</w:t>
+            </w:r>
+          </w:p>
+        </w:tc>
+        <w:tc>
+          <w:tcPr>
+            <w:tcW w:type="dxa" w:w="2880"/>
+          </w:tcPr>
+          <w:p>
+            <w:r>
+              <w:t>退出应用</w:t>
+            </w:r>
+          </w:p>
+        </w:tc>
+      </w:tr>
+    </w:tbl>
+    <w:p>
+      <w:pPr>
+        <w:pStyle w:val="Heading1"/>
+      </w:pPr>
+      <w:r>
+        <w:t>11. 验收标准</w:t>
       </w:r>
     </w:p>
     <w:p>
@@ -1070,7 +2053,7 @@
         <w:pStyle w:val="Heading2"/>
       </w:pPr>
       <w:r>
-        <w:t>10.1 Sso.Enabled=false（默认）</w:t>
+        <w:t>11.1 Sso.Enabled=false（默认）</w:t>
       </w:r>
     </w:p>
     <w:p>
@@ -1102,7 +2085,7 @@
         <w:pStyle w:val="Heading2"/>
       </w:pPr>
       <w:r>
-        <w:t>10.2 Sso.Enabled=true</w:t>
+        <w:t>11.2 Sso.Enabled=true</w:t>
       </w:r>
     </w:p>
     <w:p>
@@ -1110,7 +2093,15 @@
         <w:pStyle w:val="ListBullet"/>
       </w:pPr>
       <w:r>
-        <w:t>首次 IMP 登录 → check_ssotoken 一次 → 进入主界面</w:t>
+        <w:t>首次 IMP 登录 → GET /sso/auth → POST /sso/complete → check_ssotoken 一次 → 进入主界面</w:t>
+      </w:r>
+    </w:p>
+    <w:p>
+      <w:pPr>
+        <w:pStyle w:val="ListBullet"/>
+      </w:pPr>
+      <w:r>
+        <w:t>浏览器认证页显示登录成功状态</w:t>
       </w:r>
     </w:p>
     <w:p>
@@ -1147,10 +2138,18 @@
     </w:p>
     <w:p>
       <w:pPr>
+        <w:pStyle w:val="ListBullet"/>
+      </w:pPr>
+      <w:r>
+        <w:t>无角色用户引导至 noRoleForSubApp 页面</w:t>
+      </w:r>
+    </w:p>
+    <w:p>
+      <w:pPr>
         <w:pStyle w:val="Heading1"/>
       </w:pPr>
       <w:r>
-        <w:t>11. 附录：Debug 开关</w:t>
+        <w:t>12. 附录：Debug 开关</w:t>
       </w:r>
     </w:p>
     <w:p>

</xml_diff>